<commit_message>
fix: stop using account name as speaker label; use generic speaker-N
</commit_message>
<xml_diff>
--- a/You_Can_Find_Your_True_North/You_Can_Find_Your_True_North_transcript.docx
+++ b/You_Can_Find_Your_True_North/You_Can_Find_Your_True_North_transcript.docx
@@ -23,7 +23,7 @@
           <w:b/>
           <w:sz w:val="24"/>
         </w:rPr>
-        <w:t xml:space="preserve">Jordan B.: </w:t>
+        <w:t xml:space="preserve">speaker-0: </w:t>
       </w:r>
       <w:r>
         <w:rPr>
@@ -44,7 +44,7 @@
           <w:b/>
           <w:sz w:val="24"/>
         </w:rPr>
-        <w:t xml:space="preserve">Jordan B.: </w:t>
+        <w:t xml:space="preserve">speaker-0: </w:t>
       </w:r>
       <w:r>
         <w:rPr>
@@ -65,7 +65,7 @@
           <w:b/>
           <w:sz w:val="24"/>
         </w:rPr>
-        <w:t xml:space="preserve">Jordan B.: </w:t>
+        <w:t xml:space="preserve">speaker-0: </w:t>
       </w:r>
       <w:r>
         <w:rPr>
@@ -86,7 +86,7 @@
           <w:b/>
           <w:sz w:val="24"/>
         </w:rPr>
-        <w:t xml:space="preserve">Jordan B.: </w:t>
+        <w:t xml:space="preserve">speaker-0: </w:t>
       </w:r>
       <w:r>
         <w:rPr>
@@ -107,7 +107,7 @@
           <w:b/>
           <w:sz w:val="24"/>
         </w:rPr>
-        <w:t xml:space="preserve">Jordan B.: </w:t>
+        <w:t xml:space="preserve">speaker-0: </w:t>
       </w:r>
       <w:r>
         <w:rPr>
@@ -128,7 +128,7 @@
           <w:b/>
           <w:sz w:val="24"/>
         </w:rPr>
-        <w:t xml:space="preserve">Jordan B.: </w:t>
+        <w:t xml:space="preserve">speaker-0: </w:t>
       </w:r>
       <w:r>
         <w:rPr>
@@ -149,7 +149,7 @@
           <w:b/>
           <w:sz w:val="24"/>
         </w:rPr>
-        <w:t xml:space="preserve">Jordan B.: </w:t>
+        <w:t xml:space="preserve">speaker-0: </w:t>
       </w:r>
       <w:r>
         <w:rPr>
@@ -170,7 +170,7 @@
           <w:b/>
           <w:sz w:val="24"/>
         </w:rPr>
-        <w:t xml:space="preserve">Jordan B.: </w:t>
+        <w:t xml:space="preserve">speaker-0: </w:t>
       </w:r>
       <w:r>
         <w:rPr>
@@ -191,7 +191,7 @@
           <w:b/>
           <w:sz w:val="24"/>
         </w:rPr>
-        <w:t xml:space="preserve">Jordan B.: </w:t>
+        <w:t xml:space="preserve">speaker-0: </w:t>
       </w:r>
       <w:r>
         <w:rPr>
@@ -212,7 +212,7 @@
           <w:b/>
           <w:sz w:val="24"/>
         </w:rPr>
-        <w:t xml:space="preserve">Jordan B.: </w:t>
+        <w:t xml:space="preserve">speaker-0: </w:t>
       </w:r>
       <w:r>
         <w:rPr>
@@ -233,7 +233,7 @@
           <w:b/>
           <w:sz w:val="24"/>
         </w:rPr>
-        <w:t xml:space="preserve">Jordan B.: </w:t>
+        <w:t xml:space="preserve">speaker-0: </w:t>
       </w:r>
       <w:r>
         <w:rPr>
@@ -254,7 +254,7 @@
           <w:b/>
           <w:sz w:val="24"/>
         </w:rPr>
-        <w:t xml:space="preserve">Jordan B.: </w:t>
+        <w:t xml:space="preserve">speaker-0: </w:t>
       </w:r>
       <w:r>
         <w:rPr>
@@ -275,7 +275,7 @@
           <w:b/>
           <w:sz w:val="24"/>
         </w:rPr>
-        <w:t xml:space="preserve">Jordan B.: </w:t>
+        <w:t xml:space="preserve">speaker-0: </w:t>
       </w:r>
       <w:r>
         <w:rPr>
@@ -296,7 +296,7 @@
           <w:b/>
           <w:sz w:val="24"/>
         </w:rPr>
-        <w:t xml:space="preserve">Jordan B.: </w:t>
+        <w:t xml:space="preserve">speaker-0: </w:t>
       </w:r>
       <w:r>
         <w:rPr>
@@ -317,7 +317,7 @@
           <w:b/>
           <w:sz w:val="24"/>
         </w:rPr>
-        <w:t xml:space="preserve">Jordan B.: </w:t>
+        <w:t xml:space="preserve">speaker-0: </w:t>
       </w:r>
       <w:r>
         <w:rPr>
@@ -338,7 +338,7 @@
           <w:b/>
           <w:sz w:val="24"/>
         </w:rPr>
-        <w:t xml:space="preserve">Jordan B.: </w:t>
+        <w:t xml:space="preserve">speaker-0: </w:t>
       </w:r>
       <w:r>
         <w:rPr>
@@ -359,7 +359,7 @@
           <w:b/>
           <w:sz w:val="24"/>
         </w:rPr>
-        <w:t xml:space="preserve">Jordan B.: </w:t>
+        <w:t xml:space="preserve">speaker-0: </w:t>
       </w:r>
       <w:r>
         <w:rPr>
@@ -380,7 +380,7 @@
           <w:b/>
           <w:sz w:val="24"/>
         </w:rPr>
-        <w:t xml:space="preserve">Tony Robbins: </w:t>
+        <w:t xml:space="preserve">speaker-1: </w:t>
       </w:r>
       <w:r>
         <w:rPr>
@@ -401,7 +401,7 @@
           <w:b/>
           <w:sz w:val="24"/>
         </w:rPr>
-        <w:t xml:space="preserve">Tony Robbins: </w:t>
+        <w:t xml:space="preserve">speaker-1: </w:t>
       </w:r>
       <w:r>
         <w:rPr>
@@ -422,7 +422,7 @@
           <w:b/>
           <w:sz w:val="24"/>
         </w:rPr>
-        <w:t xml:space="preserve">Tony Robbins: </w:t>
+        <w:t xml:space="preserve">speaker-1: </w:t>
       </w:r>
       <w:r>
         <w:rPr>
@@ -443,7 +443,7 @@
           <w:b/>
           <w:sz w:val="24"/>
         </w:rPr>
-        <w:t xml:space="preserve">Jordan B.: </w:t>
+        <w:t xml:space="preserve">speaker-0: </w:t>
       </w:r>
       <w:r>
         <w:rPr>
@@ -464,7 +464,7 @@
           <w:b/>
           <w:sz w:val="24"/>
         </w:rPr>
-        <w:t xml:space="preserve">Jordan B.: </w:t>
+        <w:t xml:space="preserve">speaker-0: </w:t>
       </w:r>
       <w:r>
         <w:rPr>
@@ -485,7 +485,7 @@
           <w:b/>
           <w:sz w:val="24"/>
         </w:rPr>
-        <w:t xml:space="preserve">Jordan B.: </w:t>
+        <w:t xml:space="preserve">speaker-0: </w:t>
       </w:r>
       <w:r>
         <w:rPr>
@@ -506,7 +506,7 @@
           <w:b/>
           <w:sz w:val="24"/>
         </w:rPr>
-        <w:t xml:space="preserve">Jordan B.: </w:t>
+        <w:t xml:space="preserve">speaker-0: </w:t>
       </w:r>
       <w:r>
         <w:rPr>
@@ -527,7 +527,7 @@
           <w:b/>
           <w:sz w:val="24"/>
         </w:rPr>
-        <w:t xml:space="preserve">Jordan B.: </w:t>
+        <w:t xml:space="preserve">speaker-0: </w:t>
       </w:r>
       <w:r>
         <w:rPr>

</xml_diff>